<commit_message>
ran all R 6x6 tests.
</commit_message>
<xml_diff>
--- a/6x6_score_investigation.docx
+++ b/6x6_score_investigation.docx
@@ -407,34 +407,7 @@
           <w:szCs w:val="12"/>
           <w:lang w:val="en-US"/>
         </w:rPr>
-        <w:t xml:space="preserve"> = </w:t>
-      </w:r>
-      <w:r>
-        <w:rPr>
-          <w:color w:val="45B0E1" w:themeColor="accent1" w:themeTint="99"/>
-          <w:sz w:val="12"/>
-          <w:szCs w:val="12"/>
-          <w:lang w:val="en-US"/>
-        </w:rPr>
-        <w:t>[</w:t>
-      </w:r>
-      <w:r>
-        <w:rPr>
-          <w:color w:val="45B0E1" w:themeColor="accent1" w:themeTint="99"/>
-          <w:sz w:val="12"/>
-          <w:szCs w:val="12"/>
-          <w:lang w:val="en-US"/>
-        </w:rPr>
-        <w:t>0.0, 0.0, 0.0, 0.0, 0.0, 0.0, 0.0, 0.0, 0.0, 0.0</w:t>
-      </w:r>
-      <w:r>
-        <w:rPr>
-          <w:color w:val="45B0E1" w:themeColor="accent1" w:themeTint="99"/>
-          <w:sz w:val="12"/>
-          <w:szCs w:val="12"/>
-          <w:lang w:val="en-US"/>
-        </w:rPr>
-        <w:t>]</w:t>
+        <w:t xml:space="preserve"> = [0.0, 0.0, 0.0, 0.0, 0.0, 0.0, 0.0, 0.0, 0.0, 0.0]</w:t>
       </w:r>
     </w:p>
     <w:p>
@@ -464,34 +437,7 @@
           <w:szCs w:val="12"/>
           <w:lang w:val="en-US"/>
         </w:rPr>
-        <w:t xml:space="preserve"> = </w:t>
-      </w:r>
-      <w:r>
-        <w:rPr>
-          <w:color w:val="45B0E1" w:themeColor="accent1" w:themeTint="99"/>
-          <w:sz w:val="12"/>
-          <w:szCs w:val="12"/>
-          <w:lang w:val="en-US"/>
-        </w:rPr>
-        <w:t>[</w:t>
-      </w:r>
-      <w:r>
-        <w:rPr>
-          <w:color w:val="45B0E1" w:themeColor="accent1" w:themeTint="99"/>
-          <w:sz w:val="12"/>
-          <w:szCs w:val="12"/>
-          <w:lang w:val="en-US"/>
-        </w:rPr>
-        <w:t>0.0, 0.0, 0.0, 0.0, 0.0, 0.0, 0.0, 0.0, 0.0, 0.0</w:t>
-      </w:r>
-      <w:r>
-        <w:rPr>
-          <w:color w:val="45B0E1" w:themeColor="accent1" w:themeTint="99"/>
-          <w:sz w:val="12"/>
-          <w:szCs w:val="12"/>
-          <w:lang w:val="en-US"/>
-        </w:rPr>
-        <w:t>]</w:t>
+        <w:t xml:space="preserve"> = [0.0, 0.0, 0.0, 0.0, 0.0, 0.0, 0.0, 0.0, 0.0, 0.0]</w:t>
       </w:r>
     </w:p>
     <w:p>
@@ -2092,20 +2038,2159 @@
     <w:p>
       <w:pPr>
         <w:rPr>
-          <w:sz w:val="12"/>
-          <w:szCs w:val="12"/>
-          <w:lang w:val="en-US"/>
-        </w:rPr>
-      </w:pPr>
-    </w:p>
-    <w:p>
-      <w:pPr>
-        <w:rPr>
-          <w:sz w:val="12"/>
-          <w:szCs w:val="12"/>
-          <w:lang w:val="en-US"/>
-        </w:rPr>
-      </w:pPr>
+          <w:b/>
+          <w:bCs/>
+          <w:sz w:val="12"/>
+          <w:szCs w:val="12"/>
+          <w:lang w:val="en-US"/>
+        </w:rPr>
+      </w:pPr>
+      <w:r>
+        <w:rPr>
+          <w:b/>
+          <w:bCs/>
+          <w:sz w:val="12"/>
+          <w:szCs w:val="12"/>
+          <w:lang w:val="en-US"/>
+        </w:rPr>
+        <w:lastRenderedPageBreak/>
+        <w:t>R - COORDS</w:t>
+      </w:r>
+    </w:p>
+    <w:p>
+      <w:pPr>
+        <w:rPr>
+          <w:color w:val="45B0E1" w:themeColor="accent1" w:themeTint="99"/>
+          <w:sz w:val="12"/>
+          <w:szCs w:val="12"/>
+          <w:lang w:val="en-US"/>
+        </w:rPr>
+      </w:pPr>
+      <w:proofErr w:type="spellStart"/>
+      <w:r>
+        <w:rPr>
+          <w:color w:val="45B0E1" w:themeColor="accent1" w:themeTint="99"/>
+          <w:sz w:val="12"/>
+          <w:szCs w:val="12"/>
+          <w:lang w:val="en-US"/>
+        </w:rPr>
+        <w:t>line_adj_json</w:t>
+      </w:r>
+      <w:proofErr w:type="spellEnd"/>
+      <w:r>
+        <w:rPr>
+          <w:color w:val="45B0E1" w:themeColor="accent1" w:themeTint="99"/>
+          <w:sz w:val="12"/>
+          <w:szCs w:val="12"/>
+          <w:lang w:val="en-US"/>
+        </w:rPr>
+        <w:t xml:space="preserve"> = </w:t>
+      </w:r>
+      <w:r>
+        <w:rPr>
+          <w:color w:val="45B0E1" w:themeColor="accent1" w:themeTint="99"/>
+          <w:sz w:val="12"/>
+          <w:szCs w:val="12"/>
+          <w:lang w:val="en-US"/>
+        </w:rPr>
+        <w:t>[</w:t>
+      </w:r>
+      <w:r>
+        <w:rPr>
+          <w:color w:val="45B0E1" w:themeColor="accent1" w:themeTint="99"/>
+          <w:sz w:val="12"/>
+          <w:szCs w:val="12"/>
+          <w:lang w:val="en-US"/>
+        </w:rPr>
+        <w:t>100.0, 100.0, 100.0, 100.0, 100.0, 100.0, 100.0, 100.0, 100.0, 100.0</w:t>
+      </w:r>
+      <w:r>
+        <w:rPr>
+          <w:color w:val="45B0E1" w:themeColor="accent1" w:themeTint="99"/>
+          <w:sz w:val="12"/>
+          <w:szCs w:val="12"/>
+          <w:lang w:val="en-US"/>
+        </w:rPr>
+        <w:t>]</w:t>
+      </w:r>
+    </w:p>
+    <w:p>
+      <w:pPr>
+        <w:rPr>
+          <w:color w:val="45B0E1" w:themeColor="accent1" w:themeTint="99"/>
+          <w:sz w:val="12"/>
+          <w:szCs w:val="12"/>
+          <w:lang w:val="en-US"/>
+        </w:rPr>
+      </w:pPr>
+      <w:proofErr w:type="spellStart"/>
+      <w:r>
+        <w:rPr>
+          <w:color w:val="45B0E1" w:themeColor="accent1" w:themeTint="99"/>
+          <w:sz w:val="12"/>
+          <w:szCs w:val="12"/>
+          <w:lang w:val="en-US"/>
+        </w:rPr>
+        <w:t>line_adj_txt</w:t>
+      </w:r>
+      <w:proofErr w:type="spellEnd"/>
+      <w:r>
+        <w:rPr>
+          <w:color w:val="45B0E1" w:themeColor="accent1" w:themeTint="99"/>
+          <w:sz w:val="12"/>
+          <w:szCs w:val="12"/>
+          <w:lang w:val="en-US"/>
+        </w:rPr>
+        <w:t xml:space="preserve"> = </w:t>
+      </w:r>
+      <w:r>
+        <w:rPr>
+          <w:color w:val="45B0E1" w:themeColor="accent1" w:themeTint="99"/>
+          <w:sz w:val="12"/>
+          <w:szCs w:val="12"/>
+          <w:lang w:val="en-US"/>
+        </w:rPr>
+        <w:t>[</w:t>
+      </w:r>
+      <w:r>
+        <w:rPr>
+          <w:color w:val="45B0E1" w:themeColor="accent1" w:themeTint="99"/>
+          <w:sz w:val="12"/>
+          <w:szCs w:val="12"/>
+          <w:lang w:val="en-US"/>
+        </w:rPr>
+        <w:t>100.0, 100.0, 100.0, 100.0, 100.0, 100.0, 100.0, 100.0, 100.0, 100.0</w:t>
+      </w:r>
+      <w:r>
+        <w:rPr>
+          <w:color w:val="45B0E1" w:themeColor="accent1" w:themeTint="99"/>
+          <w:sz w:val="12"/>
+          <w:szCs w:val="12"/>
+          <w:lang w:val="en-US"/>
+        </w:rPr>
+        <w:t>]</w:t>
+      </w:r>
+    </w:p>
+    <w:p>
+      <w:pPr>
+        <w:rPr>
+          <w:color w:val="45B0E1" w:themeColor="accent1" w:themeTint="99"/>
+          <w:sz w:val="12"/>
+          <w:szCs w:val="12"/>
+          <w:lang w:val="en-US"/>
+        </w:rPr>
+      </w:pPr>
+      <w:proofErr w:type="spellStart"/>
+      <w:r>
+        <w:rPr>
+          <w:color w:val="45B0E1" w:themeColor="accent1" w:themeTint="99"/>
+          <w:sz w:val="12"/>
+          <w:szCs w:val="12"/>
+          <w:lang w:val="en-US"/>
+        </w:rPr>
+        <w:t>line_jpg</w:t>
+      </w:r>
+      <w:proofErr w:type="spellEnd"/>
+      <w:r>
+        <w:rPr>
+          <w:color w:val="45B0E1" w:themeColor="accent1" w:themeTint="99"/>
+          <w:sz w:val="12"/>
+          <w:szCs w:val="12"/>
+          <w:lang w:val="en-US"/>
+        </w:rPr>
+        <w:t xml:space="preserve"> = </w:t>
+      </w:r>
+      <w:r>
+        <w:rPr>
+          <w:color w:val="45B0E1" w:themeColor="accent1" w:themeTint="99"/>
+          <w:sz w:val="12"/>
+          <w:szCs w:val="12"/>
+          <w:lang w:val="en-US"/>
+        </w:rPr>
+        <w:t>[</w:t>
+      </w:r>
+      <w:r>
+        <w:rPr>
+          <w:color w:val="45B0E1" w:themeColor="accent1" w:themeTint="99"/>
+          <w:sz w:val="12"/>
+          <w:szCs w:val="12"/>
+          <w:lang w:val="en-US"/>
+        </w:rPr>
+        <w:t>0.0, 0.0, 0.0, 0.0, 0.0, 0.0, 0.0, 0.0, 0.0, 0.0</w:t>
+      </w:r>
+      <w:r>
+        <w:rPr>
+          <w:color w:val="45B0E1" w:themeColor="accent1" w:themeTint="99"/>
+          <w:sz w:val="12"/>
+          <w:szCs w:val="12"/>
+          <w:lang w:val="en-US"/>
+        </w:rPr>
+        <w:t>]</w:t>
+      </w:r>
+    </w:p>
+    <w:p>
+      <w:pPr>
+        <w:rPr>
+          <w:color w:val="45B0E1" w:themeColor="accent1" w:themeTint="99"/>
+          <w:sz w:val="12"/>
+          <w:szCs w:val="12"/>
+          <w:lang w:val="en-US"/>
+        </w:rPr>
+      </w:pPr>
+      <w:proofErr w:type="spellStart"/>
+      <w:r>
+        <w:rPr>
+          <w:color w:val="45B0E1" w:themeColor="accent1" w:themeTint="99"/>
+          <w:sz w:val="12"/>
+          <w:szCs w:val="12"/>
+          <w:lang w:val="en-US"/>
+        </w:rPr>
+        <w:t>line_json</w:t>
+      </w:r>
+      <w:proofErr w:type="spellEnd"/>
+      <w:r>
+        <w:rPr>
+          <w:color w:val="45B0E1" w:themeColor="accent1" w:themeTint="99"/>
+          <w:sz w:val="12"/>
+          <w:szCs w:val="12"/>
+          <w:lang w:val="en-US"/>
+        </w:rPr>
+        <w:t xml:space="preserve"> = </w:t>
+      </w:r>
+      <w:r>
+        <w:rPr>
+          <w:color w:val="45B0E1" w:themeColor="accent1" w:themeTint="99"/>
+          <w:sz w:val="12"/>
+          <w:szCs w:val="12"/>
+          <w:lang w:val="en-US"/>
+        </w:rPr>
+        <w:t>[</w:t>
+      </w:r>
+      <w:r>
+        <w:rPr>
+          <w:color w:val="45B0E1" w:themeColor="accent1" w:themeTint="99"/>
+          <w:sz w:val="12"/>
+          <w:szCs w:val="12"/>
+          <w:lang w:val="en-US"/>
+        </w:rPr>
+        <w:t>100.0, 100.0, 100.0, 100.0, 100.0, 100.0, 100.0, 100.0, 100.0, 100.0</w:t>
+      </w:r>
+      <w:r>
+        <w:rPr>
+          <w:color w:val="45B0E1" w:themeColor="accent1" w:themeTint="99"/>
+          <w:sz w:val="12"/>
+          <w:szCs w:val="12"/>
+          <w:lang w:val="en-US"/>
+        </w:rPr>
+        <w:t>]</w:t>
+      </w:r>
+    </w:p>
+    <w:p>
+      <w:pPr>
+        <w:rPr>
+          <w:color w:val="45B0E1" w:themeColor="accent1" w:themeTint="99"/>
+          <w:sz w:val="12"/>
+          <w:szCs w:val="12"/>
+          <w:lang w:val="en-US"/>
+        </w:rPr>
+      </w:pPr>
+      <w:proofErr w:type="spellStart"/>
+      <w:r>
+        <w:rPr>
+          <w:color w:val="45B0E1" w:themeColor="accent1" w:themeTint="99"/>
+          <w:sz w:val="12"/>
+          <w:szCs w:val="12"/>
+          <w:lang w:val="en-US"/>
+        </w:rPr>
+        <w:t>line_tokenized_txt</w:t>
+      </w:r>
+      <w:proofErr w:type="spellEnd"/>
+      <w:r>
+        <w:rPr>
+          <w:color w:val="45B0E1" w:themeColor="accent1" w:themeTint="99"/>
+          <w:sz w:val="12"/>
+          <w:szCs w:val="12"/>
+          <w:lang w:val="en-US"/>
+        </w:rPr>
+        <w:t xml:space="preserve"> = </w:t>
+      </w:r>
+      <w:r>
+        <w:rPr>
+          <w:color w:val="45B0E1" w:themeColor="accent1" w:themeTint="99"/>
+          <w:sz w:val="12"/>
+          <w:szCs w:val="12"/>
+          <w:lang w:val="en-US"/>
+        </w:rPr>
+        <w:t>[</w:t>
+      </w:r>
+      <w:r>
+        <w:rPr>
+          <w:color w:val="45B0E1" w:themeColor="accent1" w:themeTint="99"/>
+          <w:sz w:val="12"/>
+          <w:szCs w:val="12"/>
+          <w:lang w:val="en-US"/>
+        </w:rPr>
+        <w:t>100.0, 100.0, 100.0, 100.0, 100.0, 100.0, 100.0, 100.0, 100.0, 100.0</w:t>
+      </w:r>
+      <w:r>
+        <w:rPr>
+          <w:color w:val="45B0E1" w:themeColor="accent1" w:themeTint="99"/>
+          <w:sz w:val="12"/>
+          <w:szCs w:val="12"/>
+          <w:lang w:val="en-US"/>
+        </w:rPr>
+        <w:t>]</w:t>
+      </w:r>
+    </w:p>
+    <w:p>
+      <w:pPr>
+        <w:rPr>
+          <w:color w:val="45B0E1" w:themeColor="accent1" w:themeTint="99"/>
+          <w:sz w:val="12"/>
+          <w:szCs w:val="12"/>
+          <w:lang w:val="en-US"/>
+        </w:rPr>
+      </w:pPr>
+      <w:proofErr w:type="spellStart"/>
+      <w:r>
+        <w:rPr>
+          <w:color w:val="45B0E1" w:themeColor="accent1" w:themeTint="99"/>
+          <w:sz w:val="12"/>
+          <w:szCs w:val="12"/>
+          <w:lang w:val="en-US"/>
+        </w:rPr>
+        <w:t>occupancy_adj_json</w:t>
+      </w:r>
+      <w:proofErr w:type="spellEnd"/>
+      <w:r>
+        <w:rPr>
+          <w:color w:val="45B0E1" w:themeColor="accent1" w:themeTint="99"/>
+          <w:sz w:val="12"/>
+          <w:szCs w:val="12"/>
+          <w:lang w:val="en-US"/>
+        </w:rPr>
+        <w:t xml:space="preserve"> = </w:t>
+      </w:r>
+      <w:r>
+        <w:rPr>
+          <w:color w:val="45B0E1" w:themeColor="accent1" w:themeTint="99"/>
+          <w:sz w:val="12"/>
+          <w:szCs w:val="12"/>
+          <w:lang w:val="en-US"/>
+        </w:rPr>
+        <w:t>[</w:t>
+      </w:r>
+      <w:r>
+        <w:rPr>
+          <w:color w:val="45B0E1" w:themeColor="accent1" w:themeTint="99"/>
+          <w:sz w:val="12"/>
+          <w:szCs w:val="12"/>
+          <w:lang w:val="en-US"/>
+        </w:rPr>
+        <w:t>100.0, 100.0, 100.0, 100.0, 100.0, 100.0, 100.0, 100.0, 100.0, 100.0</w:t>
+      </w:r>
+      <w:r>
+        <w:rPr>
+          <w:color w:val="45B0E1" w:themeColor="accent1" w:themeTint="99"/>
+          <w:sz w:val="12"/>
+          <w:szCs w:val="12"/>
+          <w:lang w:val="en-US"/>
+        </w:rPr>
+        <w:t>]</w:t>
+      </w:r>
+    </w:p>
+    <w:p>
+      <w:pPr>
+        <w:rPr>
+          <w:color w:val="45B0E1" w:themeColor="accent1" w:themeTint="99"/>
+          <w:sz w:val="12"/>
+          <w:szCs w:val="12"/>
+          <w:lang w:val="en-US"/>
+        </w:rPr>
+      </w:pPr>
+      <w:proofErr w:type="spellStart"/>
+      <w:r>
+        <w:rPr>
+          <w:color w:val="45B0E1" w:themeColor="accent1" w:themeTint="99"/>
+          <w:sz w:val="12"/>
+          <w:szCs w:val="12"/>
+          <w:lang w:val="en-US"/>
+        </w:rPr>
+        <w:t>occupancy_adj_txt</w:t>
+      </w:r>
+      <w:proofErr w:type="spellEnd"/>
+      <w:r>
+        <w:rPr>
+          <w:color w:val="45B0E1" w:themeColor="accent1" w:themeTint="99"/>
+          <w:sz w:val="12"/>
+          <w:szCs w:val="12"/>
+          <w:lang w:val="en-US"/>
+        </w:rPr>
+        <w:t xml:space="preserve"> = </w:t>
+      </w:r>
+      <w:r>
+        <w:rPr>
+          <w:color w:val="45B0E1" w:themeColor="accent1" w:themeTint="99"/>
+          <w:sz w:val="12"/>
+          <w:szCs w:val="12"/>
+          <w:lang w:val="en-US"/>
+        </w:rPr>
+        <w:t>[</w:t>
+      </w:r>
+      <w:r>
+        <w:rPr>
+          <w:color w:val="45B0E1" w:themeColor="accent1" w:themeTint="99"/>
+          <w:sz w:val="12"/>
+          <w:szCs w:val="12"/>
+          <w:lang w:val="en-US"/>
+        </w:rPr>
+        <w:t>100.0, 100.0, 100.0, 100.0, 100.0, 100.0, 100.0, 100.0, 100.0, 100.0</w:t>
+      </w:r>
+      <w:r>
+        <w:rPr>
+          <w:color w:val="45B0E1" w:themeColor="accent1" w:themeTint="99"/>
+          <w:sz w:val="12"/>
+          <w:szCs w:val="12"/>
+          <w:lang w:val="en-US"/>
+        </w:rPr>
+        <w:t>]</w:t>
+      </w:r>
+    </w:p>
+    <w:p>
+      <w:pPr>
+        <w:rPr>
+          <w:sz w:val="12"/>
+          <w:szCs w:val="12"/>
+          <w:lang w:val="en-US"/>
+        </w:rPr>
+      </w:pPr>
+      <w:proofErr w:type="spellStart"/>
+      <w:r>
+        <w:rPr>
+          <w:sz w:val="12"/>
+          <w:szCs w:val="12"/>
+          <w:lang w:val="en-US"/>
+        </w:rPr>
+        <w:t>occupancy_ascii_txt</w:t>
+      </w:r>
+      <w:proofErr w:type="spellEnd"/>
+      <w:r>
+        <w:rPr>
+          <w:sz w:val="12"/>
+          <w:szCs w:val="12"/>
+          <w:lang w:val="en-US"/>
+        </w:rPr>
+        <w:t xml:space="preserve"> = </w:t>
+      </w:r>
+      <w:r>
+        <w:rPr>
+          <w:sz w:val="12"/>
+          <w:szCs w:val="12"/>
+          <w:lang w:val="en-US"/>
+        </w:rPr>
+        <w:t>[</w:t>
+      </w:r>
+      <w:r>
+        <w:rPr>
+          <w:color w:val="EE0000"/>
+          <w:sz w:val="12"/>
+          <w:szCs w:val="12"/>
+          <w:lang w:val="en-US"/>
+        </w:rPr>
+        <w:t>24.242424242424242, 32.432432432432435, 11.594202898550725, 1.7543859649122806, 31.03448275862069, 2.4390243902439024, 2.0408163265306123, 0.0, 27.27272727272727, 2.4390243902439024</w:t>
+      </w:r>
+      <w:r>
+        <w:rPr>
+          <w:color w:val="EE0000"/>
+          <w:sz w:val="12"/>
+          <w:szCs w:val="12"/>
+          <w:lang w:val="en-US"/>
+        </w:rPr>
+        <w:t>]</w:t>
+      </w:r>
+    </w:p>
+    <w:p>
+      <w:pPr>
+        <w:rPr>
+          <w:sz w:val="12"/>
+          <w:szCs w:val="12"/>
+          <w:lang w:val="en-US"/>
+        </w:rPr>
+      </w:pPr>
+      <w:proofErr w:type="spellStart"/>
+      <w:r>
+        <w:rPr>
+          <w:sz w:val="12"/>
+          <w:szCs w:val="12"/>
+          <w:lang w:val="en-US"/>
+        </w:rPr>
+        <w:t>occupancy_jpg</w:t>
+      </w:r>
+      <w:proofErr w:type="spellEnd"/>
+      <w:r>
+        <w:rPr>
+          <w:sz w:val="12"/>
+          <w:szCs w:val="12"/>
+          <w:lang w:val="en-US"/>
+        </w:rPr>
+        <w:t xml:space="preserve"> = </w:t>
+      </w:r>
+      <w:r>
+        <w:rPr>
+          <w:sz w:val="12"/>
+          <w:szCs w:val="12"/>
+          <w:lang w:val="en-US"/>
+        </w:rPr>
+        <w:t>[</w:t>
+      </w:r>
+      <w:r>
+        <w:rPr>
+          <w:sz w:val="12"/>
+          <w:szCs w:val="12"/>
+          <w:lang w:val="en-US"/>
+        </w:rPr>
+        <w:t xml:space="preserve">0.0, </w:t>
+      </w:r>
+      <w:r>
+        <w:rPr>
+          <w:color w:val="EE0000"/>
+          <w:sz w:val="12"/>
+          <w:szCs w:val="12"/>
+          <w:lang w:val="en-US"/>
+        </w:rPr>
+        <w:t>2.7027027027027026</w:t>
+      </w:r>
+      <w:r>
+        <w:rPr>
+          <w:sz w:val="12"/>
+          <w:szCs w:val="12"/>
+          <w:lang w:val="en-US"/>
+        </w:rPr>
+        <w:t xml:space="preserve">, 0.0, 0.0, 0.0, </w:t>
+      </w:r>
+      <w:r>
+        <w:rPr>
+          <w:color w:val="EE0000"/>
+          <w:sz w:val="12"/>
+          <w:szCs w:val="12"/>
+          <w:lang w:val="en-US"/>
+        </w:rPr>
+        <w:t>2.4390243902439024</w:t>
+      </w:r>
+      <w:r>
+        <w:rPr>
+          <w:sz w:val="12"/>
+          <w:szCs w:val="12"/>
+          <w:lang w:val="en-US"/>
+        </w:rPr>
+        <w:t>, 0.0, 0.0, 0.0, 0.0</w:t>
+      </w:r>
+      <w:r>
+        <w:rPr>
+          <w:sz w:val="12"/>
+          <w:szCs w:val="12"/>
+          <w:lang w:val="en-US"/>
+        </w:rPr>
+        <w:t>]</w:t>
+      </w:r>
+    </w:p>
+    <w:p>
+      <w:pPr>
+        <w:rPr>
+          <w:sz w:val="12"/>
+          <w:szCs w:val="12"/>
+          <w:lang w:val="en-US"/>
+        </w:rPr>
+      </w:pPr>
+      <w:proofErr w:type="spellStart"/>
+      <w:r>
+        <w:rPr>
+          <w:sz w:val="12"/>
+          <w:szCs w:val="12"/>
+          <w:lang w:val="en-US"/>
+        </w:rPr>
+        <w:t>occupancy_json</w:t>
+      </w:r>
+      <w:proofErr w:type="spellEnd"/>
+      <w:r>
+        <w:rPr>
+          <w:sz w:val="12"/>
+          <w:szCs w:val="12"/>
+          <w:lang w:val="en-US"/>
+        </w:rPr>
+        <w:t xml:space="preserve"> = </w:t>
+      </w:r>
+      <w:r>
+        <w:rPr>
+          <w:sz w:val="12"/>
+          <w:szCs w:val="12"/>
+          <w:lang w:val="en-US"/>
+        </w:rPr>
+        <w:t>[</w:t>
+      </w:r>
+      <w:r>
+        <w:rPr>
+          <w:color w:val="EE0000"/>
+          <w:sz w:val="12"/>
+          <w:szCs w:val="12"/>
+          <w:lang w:val="en-US"/>
+        </w:rPr>
+        <w:t>27.27272727272727, 48.64864864864865</w:t>
+      </w:r>
+      <w:r>
+        <w:rPr>
+          <w:sz w:val="12"/>
+          <w:szCs w:val="12"/>
+          <w:lang w:val="en-US"/>
+        </w:rPr>
+        <w:t xml:space="preserve">, 100.0, 100.0, 100.0, 100.0, 100.0, 100.0, </w:t>
+      </w:r>
+      <w:r>
+        <w:rPr>
+          <w:color w:val="EE0000"/>
+          <w:sz w:val="12"/>
+          <w:szCs w:val="12"/>
+          <w:lang w:val="en-US"/>
+        </w:rPr>
+        <w:t>60.60606060606061</w:t>
+      </w:r>
+      <w:r>
+        <w:rPr>
+          <w:sz w:val="12"/>
+          <w:szCs w:val="12"/>
+          <w:lang w:val="en-US"/>
+        </w:rPr>
+        <w:t>, 100.0</w:t>
+      </w:r>
+      <w:r>
+        <w:rPr>
+          <w:sz w:val="12"/>
+          <w:szCs w:val="12"/>
+          <w:lang w:val="en-US"/>
+        </w:rPr>
+        <w:t>]</w:t>
+      </w:r>
+    </w:p>
+    <w:p>
+      <w:pPr>
+        <w:rPr>
+          <w:color w:val="45B0E1" w:themeColor="accent1" w:themeTint="99"/>
+          <w:sz w:val="12"/>
+          <w:szCs w:val="12"/>
+          <w:lang w:val="en-US"/>
+        </w:rPr>
+      </w:pPr>
+      <w:proofErr w:type="spellStart"/>
+      <w:r>
+        <w:rPr>
+          <w:color w:val="45B0E1" w:themeColor="accent1" w:themeTint="99"/>
+          <w:sz w:val="12"/>
+          <w:szCs w:val="12"/>
+          <w:lang w:val="en-US"/>
+        </w:rPr>
+        <w:t>occupancy_tokenized_txt</w:t>
+      </w:r>
+      <w:proofErr w:type="spellEnd"/>
+      <w:r>
+        <w:rPr>
+          <w:color w:val="45B0E1" w:themeColor="accent1" w:themeTint="99"/>
+          <w:sz w:val="12"/>
+          <w:szCs w:val="12"/>
+          <w:lang w:val="en-US"/>
+        </w:rPr>
+        <w:t xml:space="preserve"> = </w:t>
+      </w:r>
+      <w:r>
+        <w:rPr>
+          <w:color w:val="45B0E1" w:themeColor="accent1" w:themeTint="99"/>
+          <w:sz w:val="12"/>
+          <w:szCs w:val="12"/>
+          <w:lang w:val="en-US"/>
+        </w:rPr>
+        <w:t>[</w:t>
+      </w:r>
+      <w:r>
+        <w:rPr>
+          <w:color w:val="45B0E1" w:themeColor="accent1" w:themeTint="99"/>
+          <w:sz w:val="12"/>
+          <w:szCs w:val="12"/>
+          <w:lang w:val="en-US"/>
+        </w:rPr>
+        <w:t>100.0, 100.0, 100.0, 100.0, 100.0, 100.0, 100.0, 100.0, 100.0, 100.0</w:t>
+      </w:r>
+      <w:r>
+        <w:rPr>
+          <w:color w:val="45B0E1" w:themeColor="accent1" w:themeTint="99"/>
+          <w:sz w:val="12"/>
+          <w:szCs w:val="12"/>
+          <w:lang w:val="en-US"/>
+        </w:rPr>
+        <w:t>]</w:t>
+      </w:r>
+    </w:p>
+    <w:p>
+      <w:pPr>
+        <w:rPr>
+          <w:sz w:val="12"/>
+          <w:szCs w:val="12"/>
+          <w:lang w:val="en-US"/>
+        </w:rPr>
+      </w:pPr>
+    </w:p>
+    <w:p>
+      <w:pPr>
+        <w:rPr>
+          <w:b/>
+          <w:bCs/>
+          <w:sz w:val="12"/>
+          <w:szCs w:val="12"/>
+          <w:lang w:val="en-US"/>
+        </w:rPr>
+      </w:pPr>
+      <w:r>
+        <w:rPr>
+          <w:b/>
+          <w:bCs/>
+          <w:sz w:val="12"/>
+          <w:szCs w:val="12"/>
+          <w:lang w:val="en-US"/>
+        </w:rPr>
+        <w:t xml:space="preserve"> R - ALLO </w:t>
+      </w:r>
+    </w:p>
+    <w:p>
+      <w:pPr>
+        <w:rPr>
+          <w:color w:val="45B0E1" w:themeColor="accent1" w:themeTint="99"/>
+          <w:sz w:val="12"/>
+          <w:szCs w:val="12"/>
+          <w:lang w:val="en-US"/>
+        </w:rPr>
+      </w:pPr>
+      <w:proofErr w:type="spellStart"/>
+      <w:r>
+        <w:rPr>
+          <w:color w:val="45B0E1" w:themeColor="accent1" w:themeTint="99"/>
+          <w:sz w:val="12"/>
+          <w:szCs w:val="12"/>
+          <w:lang w:val="en-US"/>
+        </w:rPr>
+        <w:t>line_adj_json</w:t>
+      </w:r>
+      <w:proofErr w:type="spellEnd"/>
+      <w:r>
+        <w:rPr>
+          <w:color w:val="45B0E1" w:themeColor="accent1" w:themeTint="99"/>
+          <w:sz w:val="12"/>
+          <w:szCs w:val="12"/>
+          <w:lang w:val="en-US"/>
+        </w:rPr>
+        <w:t xml:space="preserve"> = </w:t>
+      </w:r>
+      <w:r>
+        <w:rPr>
+          <w:color w:val="45B0E1" w:themeColor="accent1" w:themeTint="99"/>
+          <w:sz w:val="12"/>
+          <w:szCs w:val="12"/>
+          <w:lang w:val="en-US"/>
+        </w:rPr>
+        <w:t>[</w:t>
+      </w:r>
+      <w:r>
+        <w:rPr>
+          <w:color w:val="45B0E1" w:themeColor="accent1" w:themeTint="99"/>
+          <w:sz w:val="12"/>
+          <w:szCs w:val="12"/>
+          <w:lang w:val="en-US"/>
+        </w:rPr>
+        <w:t>100.0, 100.0, 100.0, 100.0, 100.0, 100.0, 100.0, 100.0, 100.0, 100.0</w:t>
+      </w:r>
+      <w:r>
+        <w:rPr>
+          <w:color w:val="45B0E1" w:themeColor="accent1" w:themeTint="99"/>
+          <w:sz w:val="12"/>
+          <w:szCs w:val="12"/>
+          <w:lang w:val="en-US"/>
+        </w:rPr>
+        <w:t>]</w:t>
+      </w:r>
+    </w:p>
+    <w:p>
+      <w:pPr>
+        <w:rPr>
+          <w:color w:val="45B0E1" w:themeColor="accent1" w:themeTint="99"/>
+          <w:sz w:val="12"/>
+          <w:szCs w:val="12"/>
+          <w:lang w:val="en-US"/>
+        </w:rPr>
+      </w:pPr>
+      <w:proofErr w:type="spellStart"/>
+      <w:r>
+        <w:rPr>
+          <w:color w:val="45B0E1" w:themeColor="accent1" w:themeTint="99"/>
+          <w:sz w:val="12"/>
+          <w:szCs w:val="12"/>
+          <w:lang w:val="en-US"/>
+        </w:rPr>
+        <w:t>line_adj_txt</w:t>
+      </w:r>
+      <w:proofErr w:type="spellEnd"/>
+      <w:r>
+        <w:rPr>
+          <w:color w:val="45B0E1" w:themeColor="accent1" w:themeTint="99"/>
+          <w:sz w:val="12"/>
+          <w:szCs w:val="12"/>
+          <w:lang w:val="en-US"/>
+        </w:rPr>
+        <w:t xml:space="preserve"> = </w:t>
+      </w:r>
+      <w:r>
+        <w:rPr>
+          <w:color w:val="45B0E1" w:themeColor="accent1" w:themeTint="99"/>
+          <w:sz w:val="12"/>
+          <w:szCs w:val="12"/>
+          <w:lang w:val="en-US"/>
+        </w:rPr>
+        <w:t>[</w:t>
+      </w:r>
+      <w:r>
+        <w:rPr>
+          <w:color w:val="45B0E1" w:themeColor="accent1" w:themeTint="99"/>
+          <w:sz w:val="12"/>
+          <w:szCs w:val="12"/>
+          <w:lang w:val="en-US"/>
+        </w:rPr>
+        <w:t>100.0, 100.0, 100.0, 100.0, 100.0, 100.0, 100.0, 100.0, 100.0, 100.0</w:t>
+      </w:r>
+      <w:r>
+        <w:rPr>
+          <w:color w:val="45B0E1" w:themeColor="accent1" w:themeTint="99"/>
+          <w:sz w:val="12"/>
+          <w:szCs w:val="12"/>
+          <w:lang w:val="en-US"/>
+        </w:rPr>
+        <w:t>]</w:t>
+      </w:r>
+    </w:p>
+    <w:p>
+      <w:pPr>
+        <w:rPr>
+          <w:sz w:val="12"/>
+          <w:szCs w:val="12"/>
+          <w:lang w:val="en-US"/>
+        </w:rPr>
+      </w:pPr>
+      <w:proofErr w:type="spellStart"/>
+      <w:r>
+        <w:rPr>
+          <w:sz w:val="12"/>
+          <w:szCs w:val="12"/>
+          <w:lang w:val="en-US"/>
+        </w:rPr>
+        <w:t>line_jpg</w:t>
+      </w:r>
+      <w:proofErr w:type="spellEnd"/>
+      <w:r>
+        <w:rPr>
+          <w:sz w:val="12"/>
+          <w:szCs w:val="12"/>
+          <w:lang w:val="en-US"/>
+        </w:rPr>
+        <w:t xml:space="preserve"> = </w:t>
+      </w:r>
+      <w:r>
+        <w:rPr>
+          <w:sz w:val="12"/>
+          <w:szCs w:val="12"/>
+          <w:lang w:val="en-US"/>
+        </w:rPr>
+        <w:t>[</w:t>
+      </w:r>
+      <w:r>
+        <w:rPr>
+          <w:sz w:val="12"/>
+          <w:szCs w:val="12"/>
+          <w:lang w:val="en-US"/>
+        </w:rPr>
+        <w:t>6.25, 5.555555555555555, 0.0, 0.0, 28.57142857142857, 15.0, 4.166666666666666, 0.0, 18.75, 0.0</w:t>
+      </w:r>
+      <w:r>
+        <w:rPr>
+          <w:sz w:val="12"/>
+          <w:szCs w:val="12"/>
+          <w:lang w:val="en-US"/>
+        </w:rPr>
+        <w:t>]</w:t>
+      </w:r>
+    </w:p>
+    <w:p>
+      <w:pPr>
+        <w:rPr>
+          <w:color w:val="45B0E1" w:themeColor="accent1" w:themeTint="99"/>
+          <w:sz w:val="12"/>
+          <w:szCs w:val="12"/>
+          <w:lang w:val="en-US"/>
+        </w:rPr>
+      </w:pPr>
+      <w:proofErr w:type="spellStart"/>
+      <w:r>
+        <w:rPr>
+          <w:color w:val="45B0E1" w:themeColor="accent1" w:themeTint="99"/>
+          <w:sz w:val="12"/>
+          <w:szCs w:val="12"/>
+          <w:lang w:val="en-US"/>
+        </w:rPr>
+        <w:t>line_json</w:t>
+      </w:r>
+      <w:proofErr w:type="spellEnd"/>
+      <w:r>
+        <w:rPr>
+          <w:color w:val="45B0E1" w:themeColor="accent1" w:themeTint="99"/>
+          <w:sz w:val="12"/>
+          <w:szCs w:val="12"/>
+          <w:lang w:val="en-US"/>
+        </w:rPr>
+        <w:t xml:space="preserve"> = </w:t>
+      </w:r>
+      <w:r>
+        <w:rPr>
+          <w:color w:val="45B0E1" w:themeColor="accent1" w:themeTint="99"/>
+          <w:sz w:val="12"/>
+          <w:szCs w:val="12"/>
+          <w:lang w:val="en-US"/>
+        </w:rPr>
+        <w:t>[</w:t>
+      </w:r>
+      <w:r>
+        <w:rPr>
+          <w:color w:val="45B0E1" w:themeColor="accent1" w:themeTint="99"/>
+          <w:sz w:val="12"/>
+          <w:szCs w:val="12"/>
+          <w:lang w:val="en-US"/>
+        </w:rPr>
+        <w:t>100.0, 100.0, 100.0, 100.0, 100.0, 100.0, 100.0, 100.0, 100.0, 100.0</w:t>
+      </w:r>
+      <w:r>
+        <w:rPr>
+          <w:color w:val="45B0E1" w:themeColor="accent1" w:themeTint="99"/>
+          <w:sz w:val="12"/>
+          <w:szCs w:val="12"/>
+          <w:lang w:val="en-US"/>
+        </w:rPr>
+        <w:t>]</w:t>
+      </w:r>
+    </w:p>
+    <w:p>
+      <w:pPr>
+        <w:rPr>
+          <w:sz w:val="12"/>
+          <w:szCs w:val="12"/>
+          <w:lang w:val="en-US"/>
+        </w:rPr>
+      </w:pPr>
+      <w:proofErr w:type="spellStart"/>
+      <w:r>
+        <w:rPr>
+          <w:sz w:val="12"/>
+          <w:szCs w:val="12"/>
+          <w:lang w:val="en-US"/>
+        </w:rPr>
+        <w:t>line_tokenized_txt</w:t>
+      </w:r>
+      <w:proofErr w:type="spellEnd"/>
+      <w:r>
+        <w:rPr>
+          <w:sz w:val="12"/>
+          <w:szCs w:val="12"/>
+          <w:lang w:val="en-US"/>
+        </w:rPr>
+        <w:t xml:space="preserve"> = </w:t>
+      </w:r>
+      <w:r>
+        <w:rPr>
+          <w:sz w:val="12"/>
+          <w:szCs w:val="12"/>
+          <w:lang w:val="en-US"/>
+        </w:rPr>
+        <w:t>[</w:t>
+      </w:r>
+      <w:r>
+        <w:rPr>
+          <w:sz w:val="12"/>
+          <w:szCs w:val="12"/>
+          <w:lang w:val="en-US"/>
+        </w:rPr>
+        <w:t xml:space="preserve">100.0, 100.0, </w:t>
+      </w:r>
+      <w:r>
+        <w:rPr>
+          <w:color w:val="EE0000"/>
+          <w:sz w:val="12"/>
+          <w:szCs w:val="12"/>
+          <w:lang w:val="en-US"/>
+        </w:rPr>
+        <w:t>38.23529411764706,</w:t>
+      </w:r>
+      <w:r>
+        <w:rPr>
+          <w:sz w:val="12"/>
+          <w:szCs w:val="12"/>
+          <w:lang w:val="en-US"/>
+        </w:rPr>
+        <w:t xml:space="preserve"> 100.0, 100.0, 100.0, 100.0, 100.0, 100.0, 100.0</w:t>
+      </w:r>
+      <w:r>
+        <w:rPr>
+          <w:sz w:val="12"/>
+          <w:szCs w:val="12"/>
+          <w:lang w:val="en-US"/>
+        </w:rPr>
+        <w:t>]</w:t>
+      </w:r>
+    </w:p>
+    <w:p>
+      <w:pPr>
+        <w:rPr>
+          <w:color w:val="45B0E1" w:themeColor="accent1" w:themeTint="99"/>
+          <w:sz w:val="12"/>
+          <w:szCs w:val="12"/>
+          <w:lang w:val="en-US"/>
+        </w:rPr>
+      </w:pPr>
+      <w:proofErr w:type="spellStart"/>
+      <w:r>
+        <w:rPr>
+          <w:color w:val="45B0E1" w:themeColor="accent1" w:themeTint="99"/>
+          <w:sz w:val="12"/>
+          <w:szCs w:val="12"/>
+          <w:lang w:val="en-US"/>
+        </w:rPr>
+        <w:t>occupancy_adj_json</w:t>
+      </w:r>
+      <w:proofErr w:type="spellEnd"/>
+      <w:r>
+        <w:rPr>
+          <w:color w:val="45B0E1" w:themeColor="accent1" w:themeTint="99"/>
+          <w:sz w:val="12"/>
+          <w:szCs w:val="12"/>
+          <w:lang w:val="en-US"/>
+        </w:rPr>
+        <w:t xml:space="preserve"> = </w:t>
+      </w:r>
+      <w:r>
+        <w:rPr>
+          <w:color w:val="45B0E1" w:themeColor="accent1" w:themeTint="99"/>
+          <w:sz w:val="12"/>
+          <w:szCs w:val="12"/>
+          <w:lang w:val="en-US"/>
+        </w:rPr>
+        <w:t>[</w:t>
+      </w:r>
+      <w:r>
+        <w:rPr>
+          <w:color w:val="45B0E1" w:themeColor="accent1" w:themeTint="99"/>
+          <w:sz w:val="12"/>
+          <w:szCs w:val="12"/>
+          <w:lang w:val="en-US"/>
+        </w:rPr>
+        <w:t>100.0, 100.0, 100.0, 100.0, 100.0, 100.0, 100.0, 100.0, 100.0, 100.0</w:t>
+      </w:r>
+      <w:r>
+        <w:rPr>
+          <w:color w:val="45B0E1" w:themeColor="accent1" w:themeTint="99"/>
+          <w:sz w:val="12"/>
+          <w:szCs w:val="12"/>
+          <w:lang w:val="en-US"/>
+        </w:rPr>
+        <w:t>]</w:t>
+      </w:r>
+    </w:p>
+    <w:p>
+      <w:pPr>
+        <w:rPr>
+          <w:color w:val="45B0E1" w:themeColor="accent1" w:themeTint="99"/>
+          <w:sz w:val="12"/>
+          <w:szCs w:val="12"/>
+          <w:lang w:val="en-US"/>
+        </w:rPr>
+      </w:pPr>
+      <w:proofErr w:type="spellStart"/>
+      <w:r>
+        <w:rPr>
+          <w:color w:val="45B0E1" w:themeColor="accent1" w:themeTint="99"/>
+          <w:sz w:val="12"/>
+          <w:szCs w:val="12"/>
+          <w:lang w:val="en-US"/>
+        </w:rPr>
+        <w:t>occupancy_adj_txt</w:t>
+      </w:r>
+      <w:proofErr w:type="spellEnd"/>
+      <w:r>
+        <w:rPr>
+          <w:color w:val="45B0E1" w:themeColor="accent1" w:themeTint="99"/>
+          <w:sz w:val="12"/>
+          <w:szCs w:val="12"/>
+          <w:lang w:val="en-US"/>
+        </w:rPr>
+        <w:t xml:space="preserve"> = </w:t>
+      </w:r>
+      <w:r>
+        <w:rPr>
+          <w:color w:val="45B0E1" w:themeColor="accent1" w:themeTint="99"/>
+          <w:sz w:val="12"/>
+          <w:szCs w:val="12"/>
+          <w:lang w:val="en-US"/>
+        </w:rPr>
+        <w:t>[</w:t>
+      </w:r>
+      <w:r>
+        <w:rPr>
+          <w:color w:val="45B0E1" w:themeColor="accent1" w:themeTint="99"/>
+          <w:sz w:val="12"/>
+          <w:szCs w:val="12"/>
+          <w:lang w:val="en-US"/>
+        </w:rPr>
+        <w:t>100.0, 100.0, 100.0, 100.0, 100.0, 100.0, 100.0, 100.0, 100.0, 100.0</w:t>
+      </w:r>
+      <w:r>
+        <w:rPr>
+          <w:color w:val="45B0E1" w:themeColor="accent1" w:themeTint="99"/>
+          <w:sz w:val="12"/>
+          <w:szCs w:val="12"/>
+          <w:lang w:val="en-US"/>
+        </w:rPr>
+        <w:t>]</w:t>
+      </w:r>
+    </w:p>
+    <w:p>
+      <w:pPr>
+        <w:rPr>
+          <w:sz w:val="12"/>
+          <w:szCs w:val="12"/>
+          <w:lang w:val="en-US"/>
+        </w:rPr>
+      </w:pPr>
+      <w:proofErr w:type="spellStart"/>
+      <w:r>
+        <w:rPr>
+          <w:sz w:val="12"/>
+          <w:szCs w:val="12"/>
+          <w:lang w:val="en-US"/>
+        </w:rPr>
+        <w:t>occupancy_ascii_txt</w:t>
+      </w:r>
+      <w:proofErr w:type="spellEnd"/>
+      <w:r>
+        <w:rPr>
+          <w:sz w:val="12"/>
+          <w:szCs w:val="12"/>
+          <w:lang w:val="en-US"/>
+        </w:rPr>
+        <w:t xml:space="preserve"> = </w:t>
+      </w:r>
+      <w:r>
+        <w:rPr>
+          <w:sz w:val="12"/>
+          <w:szCs w:val="12"/>
+          <w:lang w:val="en-US"/>
+        </w:rPr>
+        <w:t>[</w:t>
+      </w:r>
+      <w:r>
+        <w:rPr>
+          <w:sz w:val="12"/>
+          <w:szCs w:val="12"/>
+          <w:lang w:val="en-US"/>
+        </w:rPr>
+        <w:t>6.25, 0.0, 0.0, 25.0, 14.285714285714285, 55.00000000000001, 12.5, 35.0, 25.0, 10.0</w:t>
+      </w:r>
+      <w:r>
+        <w:rPr>
+          <w:sz w:val="12"/>
+          <w:szCs w:val="12"/>
+          <w:lang w:val="en-US"/>
+        </w:rPr>
+        <w:t>]</w:t>
+      </w:r>
+    </w:p>
+    <w:p>
+      <w:pPr>
+        <w:rPr>
+          <w:sz w:val="12"/>
+          <w:szCs w:val="12"/>
+          <w:lang w:val="en-US"/>
+        </w:rPr>
+      </w:pPr>
+      <w:proofErr w:type="spellStart"/>
+      <w:r>
+        <w:rPr>
+          <w:sz w:val="12"/>
+          <w:szCs w:val="12"/>
+          <w:lang w:val="en-US"/>
+        </w:rPr>
+        <w:t>occupancy_jpg</w:t>
+      </w:r>
+      <w:proofErr w:type="spellEnd"/>
+      <w:r>
+        <w:rPr>
+          <w:sz w:val="12"/>
+          <w:szCs w:val="12"/>
+          <w:lang w:val="en-US"/>
+        </w:rPr>
+        <w:t xml:space="preserve"> = </w:t>
+      </w:r>
+      <w:r>
+        <w:rPr>
+          <w:sz w:val="12"/>
+          <w:szCs w:val="12"/>
+          <w:lang w:val="en-US"/>
+        </w:rPr>
+        <w:t>[</w:t>
+      </w:r>
+      <w:r>
+        <w:rPr>
+          <w:sz w:val="12"/>
+          <w:szCs w:val="12"/>
+          <w:lang w:val="en-US"/>
+        </w:rPr>
+        <w:t>18.75, 5.555555555555555, 4.411764705882353, 14.285714285714285, 7.142857142857142, 5.0, 4.166666666666666, 0.0, 9.375, 5.0</w:t>
+      </w:r>
+      <w:r>
+        <w:rPr>
+          <w:sz w:val="12"/>
+          <w:szCs w:val="12"/>
+          <w:lang w:val="en-US"/>
+        </w:rPr>
+        <w:t>]</w:t>
+      </w:r>
+    </w:p>
+    <w:p>
+      <w:pPr>
+        <w:rPr>
+          <w:sz w:val="12"/>
+          <w:szCs w:val="12"/>
+          <w:lang w:val="en-US"/>
+        </w:rPr>
+      </w:pPr>
+      <w:proofErr w:type="spellStart"/>
+      <w:r>
+        <w:rPr>
+          <w:sz w:val="12"/>
+          <w:szCs w:val="12"/>
+          <w:lang w:val="en-US"/>
+        </w:rPr>
+        <w:t>occupancy_json</w:t>
+      </w:r>
+      <w:proofErr w:type="spellEnd"/>
+      <w:r>
+        <w:rPr>
+          <w:sz w:val="12"/>
+          <w:szCs w:val="12"/>
+          <w:lang w:val="en-US"/>
+        </w:rPr>
+        <w:t xml:space="preserve"> = </w:t>
+      </w:r>
+      <w:r>
+        <w:rPr>
+          <w:sz w:val="12"/>
+          <w:szCs w:val="12"/>
+          <w:lang w:val="en-US"/>
+        </w:rPr>
+        <w:t>[</w:t>
+      </w:r>
+      <w:r>
+        <w:rPr>
+          <w:color w:val="EE0000"/>
+          <w:sz w:val="12"/>
+          <w:szCs w:val="12"/>
+          <w:lang w:val="en-US"/>
+        </w:rPr>
+        <w:t xml:space="preserve">56.25, </w:t>
+      </w:r>
+      <w:r>
+        <w:rPr>
+          <w:sz w:val="12"/>
+          <w:szCs w:val="12"/>
+          <w:lang w:val="en-US"/>
+        </w:rPr>
+        <w:t xml:space="preserve">100.0, 100.0, </w:t>
+      </w:r>
+      <w:r>
+        <w:rPr>
+          <w:color w:val="EE0000"/>
+          <w:sz w:val="12"/>
+          <w:szCs w:val="12"/>
+          <w:lang w:val="en-US"/>
+        </w:rPr>
+        <w:t xml:space="preserve">7.142857142857142, </w:t>
+      </w:r>
+      <w:r>
+        <w:rPr>
+          <w:sz w:val="12"/>
+          <w:szCs w:val="12"/>
+          <w:lang w:val="en-US"/>
+        </w:rPr>
+        <w:t xml:space="preserve">100.0, 100.0, 100.0, 100.0, 100.0, </w:t>
+      </w:r>
+      <w:r>
+        <w:rPr>
+          <w:color w:val="EE0000"/>
+          <w:sz w:val="12"/>
+          <w:szCs w:val="12"/>
+          <w:lang w:val="en-US"/>
+        </w:rPr>
+        <w:t>37.5</w:t>
+      </w:r>
+      <w:r>
+        <w:rPr>
+          <w:sz w:val="12"/>
+          <w:szCs w:val="12"/>
+          <w:lang w:val="en-US"/>
+        </w:rPr>
+        <w:t>]</w:t>
+      </w:r>
+    </w:p>
+    <w:p>
+      <w:pPr>
+        <w:rPr>
+          <w:sz w:val="12"/>
+          <w:szCs w:val="12"/>
+          <w:lang w:val="en-US"/>
+        </w:rPr>
+      </w:pPr>
+      <w:proofErr w:type="spellStart"/>
+      <w:r>
+        <w:rPr>
+          <w:sz w:val="12"/>
+          <w:szCs w:val="12"/>
+          <w:lang w:val="en-US"/>
+        </w:rPr>
+        <w:t>occupancy_tokenized_txt</w:t>
+      </w:r>
+      <w:proofErr w:type="spellEnd"/>
+      <w:r>
+        <w:rPr>
+          <w:sz w:val="12"/>
+          <w:szCs w:val="12"/>
+          <w:lang w:val="en-US"/>
+        </w:rPr>
+        <w:t xml:space="preserve"> = </w:t>
+      </w:r>
+      <w:r>
+        <w:rPr>
+          <w:sz w:val="12"/>
+          <w:szCs w:val="12"/>
+          <w:lang w:val="en-US"/>
+        </w:rPr>
+        <w:t>[</w:t>
+      </w:r>
+      <w:r>
+        <w:rPr>
+          <w:sz w:val="12"/>
+          <w:szCs w:val="12"/>
+          <w:lang w:val="en-US"/>
+        </w:rPr>
+        <w:t xml:space="preserve">100.0, 100.0, </w:t>
+      </w:r>
+      <w:r>
+        <w:rPr>
+          <w:color w:val="EE0000"/>
+          <w:sz w:val="12"/>
+          <w:szCs w:val="12"/>
+          <w:lang w:val="en-US"/>
+        </w:rPr>
+        <w:t>51.470588235294116</w:t>
+      </w:r>
+      <w:r>
+        <w:rPr>
+          <w:sz w:val="12"/>
+          <w:szCs w:val="12"/>
+          <w:lang w:val="en-US"/>
+        </w:rPr>
+        <w:t>, 100.0, 100.0, 100.0, 100.0, 100.0, 100.0, 100.0</w:t>
+      </w:r>
+      <w:r>
+        <w:rPr>
+          <w:sz w:val="12"/>
+          <w:szCs w:val="12"/>
+          <w:lang w:val="en-US"/>
+        </w:rPr>
+        <w:t>]</w:t>
+      </w:r>
+    </w:p>
+    <w:p>
+      <w:pPr>
+        <w:rPr>
+          <w:sz w:val="12"/>
+          <w:szCs w:val="12"/>
+          <w:lang w:val="en-US"/>
+        </w:rPr>
+      </w:pPr>
+    </w:p>
+    <w:p>
+      <w:pPr>
+        <w:rPr>
+          <w:sz w:val="12"/>
+          <w:szCs w:val="12"/>
+          <w:lang w:val="en-US"/>
+        </w:rPr>
+      </w:pPr>
+    </w:p>
+    <w:p>
+      <w:pPr>
+        <w:rPr>
+          <w:b/>
+          <w:bCs/>
+          <w:sz w:val="12"/>
+          <w:szCs w:val="12"/>
+          <w:lang w:val="en-US"/>
+        </w:rPr>
+      </w:pPr>
+      <w:r>
+        <w:rPr>
+          <w:b/>
+          <w:bCs/>
+          <w:sz w:val="12"/>
+          <w:szCs w:val="12"/>
+          <w:lang w:val="en-US"/>
+        </w:rPr>
+        <w:t xml:space="preserve">R - EGO </w:t>
+      </w:r>
+    </w:p>
+    <w:p>
+      <w:pPr>
+        <w:rPr>
+          <w:color w:val="45B0E1" w:themeColor="accent1" w:themeTint="99"/>
+          <w:sz w:val="12"/>
+          <w:szCs w:val="12"/>
+          <w:lang w:val="en-US"/>
+        </w:rPr>
+      </w:pPr>
+      <w:proofErr w:type="spellStart"/>
+      <w:r>
+        <w:rPr>
+          <w:color w:val="45B0E1" w:themeColor="accent1" w:themeTint="99"/>
+          <w:sz w:val="12"/>
+          <w:szCs w:val="12"/>
+          <w:lang w:val="en-US"/>
+        </w:rPr>
+        <w:t>line_adj_json</w:t>
+      </w:r>
+      <w:proofErr w:type="spellEnd"/>
+      <w:r>
+        <w:rPr>
+          <w:color w:val="45B0E1" w:themeColor="accent1" w:themeTint="99"/>
+          <w:sz w:val="12"/>
+          <w:szCs w:val="12"/>
+          <w:lang w:val="en-US"/>
+        </w:rPr>
+        <w:t xml:space="preserve"> = </w:t>
+      </w:r>
+      <w:r>
+        <w:rPr>
+          <w:color w:val="45B0E1" w:themeColor="accent1" w:themeTint="99"/>
+          <w:sz w:val="12"/>
+          <w:szCs w:val="12"/>
+          <w:lang w:val="en-US"/>
+        </w:rPr>
+        <w:t>[</w:t>
+      </w:r>
+      <w:r>
+        <w:rPr>
+          <w:color w:val="45B0E1" w:themeColor="accent1" w:themeTint="99"/>
+          <w:sz w:val="12"/>
+          <w:szCs w:val="12"/>
+          <w:lang w:val="en-US"/>
+        </w:rPr>
+        <w:t>100.0, 100.0, 100.0, 100.0, 100.0, 100.0, 100.0, 100.0, 100.0, 100.0</w:t>
+      </w:r>
+      <w:r>
+        <w:rPr>
+          <w:color w:val="45B0E1" w:themeColor="accent1" w:themeTint="99"/>
+          <w:sz w:val="12"/>
+          <w:szCs w:val="12"/>
+          <w:lang w:val="en-US"/>
+        </w:rPr>
+        <w:t>]</w:t>
+      </w:r>
+    </w:p>
+    <w:p>
+      <w:pPr>
+        <w:rPr>
+          <w:sz w:val="12"/>
+          <w:szCs w:val="12"/>
+          <w:lang w:val="en-US"/>
+        </w:rPr>
+      </w:pPr>
+      <w:proofErr w:type="spellStart"/>
+      <w:r>
+        <w:rPr>
+          <w:sz w:val="12"/>
+          <w:szCs w:val="12"/>
+          <w:lang w:val="en-US"/>
+        </w:rPr>
+        <w:t>line_adj_txt</w:t>
+      </w:r>
+      <w:proofErr w:type="spellEnd"/>
+      <w:r>
+        <w:rPr>
+          <w:sz w:val="12"/>
+          <w:szCs w:val="12"/>
+          <w:lang w:val="en-US"/>
+        </w:rPr>
+        <w:t xml:space="preserve"> = </w:t>
+      </w:r>
+      <w:r>
+        <w:rPr>
+          <w:sz w:val="12"/>
+          <w:szCs w:val="12"/>
+          <w:lang w:val="en-US"/>
+        </w:rPr>
+        <w:t>[</w:t>
+      </w:r>
+      <w:r>
+        <w:rPr>
+          <w:sz w:val="12"/>
+          <w:szCs w:val="12"/>
+          <w:lang w:val="en-US"/>
+        </w:rPr>
+        <w:t>100.0</w:t>
+      </w:r>
+      <w:r>
+        <w:rPr>
+          <w:color w:val="EE0000"/>
+          <w:sz w:val="12"/>
+          <w:szCs w:val="12"/>
+          <w:lang w:val="en-US"/>
+        </w:rPr>
+        <w:t xml:space="preserve">, 5.555555555555555, </w:t>
+      </w:r>
+      <w:r>
+        <w:rPr>
+          <w:sz w:val="12"/>
+          <w:szCs w:val="12"/>
+          <w:lang w:val="en-US"/>
+        </w:rPr>
+        <w:t>100.0, 100.0, 100.0, 100.0, 100.0, 100.0, 100.0, 100.0</w:t>
+      </w:r>
+      <w:r>
+        <w:rPr>
+          <w:sz w:val="12"/>
+          <w:szCs w:val="12"/>
+          <w:lang w:val="en-US"/>
+        </w:rPr>
+        <w:t>]</w:t>
+      </w:r>
+    </w:p>
+    <w:p>
+      <w:pPr>
+        <w:rPr>
+          <w:sz w:val="12"/>
+          <w:szCs w:val="12"/>
+          <w:lang w:val="en-US"/>
+        </w:rPr>
+      </w:pPr>
+      <w:proofErr w:type="spellStart"/>
+      <w:r>
+        <w:rPr>
+          <w:sz w:val="12"/>
+          <w:szCs w:val="12"/>
+          <w:lang w:val="en-US"/>
+        </w:rPr>
+        <w:t>line_jpg</w:t>
+      </w:r>
+      <w:proofErr w:type="spellEnd"/>
+      <w:r>
+        <w:rPr>
+          <w:sz w:val="12"/>
+          <w:szCs w:val="12"/>
+          <w:lang w:val="en-US"/>
+        </w:rPr>
+        <w:t xml:space="preserve"> = </w:t>
+      </w:r>
+      <w:r>
+        <w:rPr>
+          <w:sz w:val="12"/>
+          <w:szCs w:val="12"/>
+          <w:lang w:val="en-US"/>
+        </w:rPr>
+        <w:t>[</w:t>
+      </w:r>
+      <w:r>
+        <w:rPr>
+          <w:sz w:val="12"/>
+          <w:szCs w:val="12"/>
+          <w:lang w:val="en-US"/>
+        </w:rPr>
+        <w:t>12.5, 11.11111111111111, 0.0, 0.0, 21.428571428571427, 0.0, 4.166666666666666, 0.0, 31.25, 0.0</w:t>
+      </w:r>
+      <w:r>
+        <w:rPr>
+          <w:sz w:val="12"/>
+          <w:szCs w:val="12"/>
+          <w:lang w:val="en-US"/>
+        </w:rPr>
+        <w:t>]</w:t>
+      </w:r>
+    </w:p>
+    <w:p>
+      <w:pPr>
+        <w:rPr>
+          <w:sz w:val="12"/>
+          <w:szCs w:val="12"/>
+          <w:lang w:val="en-US"/>
+        </w:rPr>
+      </w:pPr>
+      <w:proofErr w:type="spellStart"/>
+      <w:r>
+        <w:rPr>
+          <w:sz w:val="12"/>
+          <w:szCs w:val="12"/>
+          <w:lang w:val="en-US"/>
+        </w:rPr>
+        <w:t>line_json</w:t>
+      </w:r>
+      <w:proofErr w:type="spellEnd"/>
+      <w:r>
+        <w:rPr>
+          <w:sz w:val="12"/>
+          <w:szCs w:val="12"/>
+          <w:lang w:val="en-US"/>
+        </w:rPr>
+        <w:t xml:space="preserve"> = </w:t>
+      </w:r>
+      <w:r>
+        <w:rPr>
+          <w:sz w:val="12"/>
+          <w:szCs w:val="12"/>
+          <w:lang w:val="en-US"/>
+        </w:rPr>
+        <w:t>[</w:t>
+      </w:r>
+      <w:r>
+        <w:rPr>
+          <w:sz w:val="12"/>
+          <w:szCs w:val="12"/>
+          <w:lang w:val="en-US"/>
+        </w:rPr>
+        <w:t xml:space="preserve">100.0, </w:t>
+      </w:r>
+      <w:r>
+        <w:rPr>
+          <w:color w:val="EE0000"/>
+          <w:sz w:val="12"/>
+          <w:szCs w:val="12"/>
+          <w:lang w:val="en-US"/>
+        </w:rPr>
+        <w:t xml:space="preserve">16.666666666666664, </w:t>
+      </w:r>
+      <w:r>
+        <w:rPr>
+          <w:sz w:val="12"/>
+          <w:szCs w:val="12"/>
+          <w:lang w:val="en-US"/>
+        </w:rPr>
+        <w:t xml:space="preserve">100.0, 100.0, 100.0, 100.0, </w:t>
+      </w:r>
+      <w:r>
+        <w:rPr>
+          <w:color w:val="EE0000"/>
+          <w:sz w:val="12"/>
+          <w:szCs w:val="12"/>
+          <w:lang w:val="en-US"/>
+        </w:rPr>
+        <w:t>83.33333333333334</w:t>
+      </w:r>
+      <w:r>
+        <w:rPr>
+          <w:sz w:val="12"/>
+          <w:szCs w:val="12"/>
+          <w:lang w:val="en-US"/>
+        </w:rPr>
+        <w:t>, 100.0</w:t>
+      </w:r>
+      <w:r>
+        <w:rPr>
+          <w:color w:val="EE0000"/>
+          <w:sz w:val="12"/>
+          <w:szCs w:val="12"/>
+          <w:lang w:val="en-US"/>
+        </w:rPr>
+        <w:t xml:space="preserve">, 6.25, </w:t>
+      </w:r>
+      <w:r>
+        <w:rPr>
+          <w:sz w:val="12"/>
+          <w:szCs w:val="12"/>
+          <w:lang w:val="en-US"/>
+        </w:rPr>
+        <w:t>100.0</w:t>
+      </w:r>
+      <w:r>
+        <w:rPr>
+          <w:sz w:val="12"/>
+          <w:szCs w:val="12"/>
+          <w:lang w:val="en-US"/>
+        </w:rPr>
+        <w:t>]</w:t>
+      </w:r>
+    </w:p>
+    <w:p>
+      <w:pPr>
+        <w:rPr>
+          <w:sz w:val="12"/>
+          <w:szCs w:val="12"/>
+          <w:lang w:val="en-US"/>
+        </w:rPr>
+      </w:pPr>
+      <w:proofErr w:type="spellStart"/>
+      <w:r>
+        <w:rPr>
+          <w:sz w:val="12"/>
+          <w:szCs w:val="12"/>
+          <w:lang w:val="en-US"/>
+        </w:rPr>
+        <w:t>line_tokenized_txt</w:t>
+      </w:r>
+      <w:proofErr w:type="spellEnd"/>
+      <w:r>
+        <w:rPr>
+          <w:sz w:val="12"/>
+          <w:szCs w:val="12"/>
+          <w:lang w:val="en-US"/>
+        </w:rPr>
+        <w:t xml:space="preserve"> = </w:t>
+      </w:r>
+      <w:r>
+        <w:rPr>
+          <w:sz w:val="12"/>
+          <w:szCs w:val="12"/>
+          <w:lang w:val="en-US"/>
+        </w:rPr>
+        <w:t>[</w:t>
+      </w:r>
+      <w:r>
+        <w:rPr>
+          <w:sz w:val="12"/>
+          <w:szCs w:val="12"/>
+          <w:lang w:val="en-US"/>
+        </w:rPr>
+        <w:t xml:space="preserve">100.0, 100.0, </w:t>
+      </w:r>
+      <w:r>
+        <w:rPr>
+          <w:color w:val="EE0000"/>
+          <w:sz w:val="12"/>
+          <w:szCs w:val="12"/>
+          <w:lang w:val="en-US"/>
+        </w:rPr>
+        <w:t>38.23529411764706</w:t>
+      </w:r>
+      <w:r>
+        <w:rPr>
+          <w:sz w:val="12"/>
+          <w:szCs w:val="12"/>
+          <w:lang w:val="en-US"/>
+        </w:rPr>
+        <w:t>, 100.0, 100.0, 100.0, 100.0, 100.0, 100.0, 100.0</w:t>
+      </w:r>
+      <w:r>
+        <w:rPr>
+          <w:sz w:val="12"/>
+          <w:szCs w:val="12"/>
+          <w:lang w:val="en-US"/>
+        </w:rPr>
+        <w:t>]</w:t>
+      </w:r>
+    </w:p>
+    <w:p>
+      <w:pPr>
+        <w:rPr>
+          <w:sz w:val="12"/>
+          <w:szCs w:val="12"/>
+          <w:lang w:val="en-US"/>
+        </w:rPr>
+      </w:pPr>
+      <w:proofErr w:type="spellStart"/>
+      <w:r>
+        <w:rPr>
+          <w:sz w:val="12"/>
+          <w:szCs w:val="12"/>
+          <w:lang w:val="en-US"/>
+        </w:rPr>
+        <w:t>occupancy_adj_json</w:t>
+      </w:r>
+      <w:proofErr w:type="spellEnd"/>
+      <w:r>
+        <w:rPr>
+          <w:sz w:val="12"/>
+          <w:szCs w:val="12"/>
+          <w:lang w:val="en-US"/>
+        </w:rPr>
+        <w:t xml:space="preserve"> = </w:t>
+      </w:r>
+      <w:r>
+        <w:rPr>
+          <w:sz w:val="12"/>
+          <w:szCs w:val="12"/>
+          <w:lang w:val="en-US"/>
+        </w:rPr>
+        <w:t>[</w:t>
+      </w:r>
+      <w:r>
+        <w:rPr>
+          <w:sz w:val="12"/>
+          <w:szCs w:val="12"/>
+          <w:lang w:val="en-US"/>
+        </w:rPr>
+        <w:t xml:space="preserve">100.0, 100.0, </w:t>
+      </w:r>
+      <w:r>
+        <w:rPr>
+          <w:color w:val="EE0000"/>
+          <w:sz w:val="12"/>
+          <w:szCs w:val="12"/>
+          <w:lang w:val="en-US"/>
+        </w:rPr>
+        <w:t>110.00000000000001</w:t>
+      </w:r>
+      <w:r>
+        <w:rPr>
+          <w:sz w:val="12"/>
+          <w:szCs w:val="12"/>
+          <w:lang w:val="en-US"/>
+        </w:rPr>
+        <w:t>, 100.0, 100.0, 100.0, 100.0, 0.0, 100.0, 100.0</w:t>
+      </w:r>
+      <w:r>
+        <w:rPr>
+          <w:sz w:val="12"/>
+          <w:szCs w:val="12"/>
+          <w:lang w:val="en-US"/>
+        </w:rPr>
+        <w:t>]</w:t>
+      </w:r>
+    </w:p>
+    <w:p>
+      <w:pPr>
+        <w:rPr>
+          <w:color w:val="45B0E1" w:themeColor="accent1" w:themeTint="99"/>
+          <w:sz w:val="12"/>
+          <w:szCs w:val="12"/>
+          <w:lang w:val="en-US"/>
+        </w:rPr>
+      </w:pPr>
+      <w:proofErr w:type="spellStart"/>
+      <w:r>
+        <w:rPr>
+          <w:color w:val="45B0E1" w:themeColor="accent1" w:themeTint="99"/>
+          <w:sz w:val="12"/>
+          <w:szCs w:val="12"/>
+          <w:lang w:val="en-US"/>
+        </w:rPr>
+        <w:t>occupancy_adj_txt</w:t>
+      </w:r>
+      <w:proofErr w:type="spellEnd"/>
+      <w:r>
+        <w:rPr>
+          <w:color w:val="45B0E1" w:themeColor="accent1" w:themeTint="99"/>
+          <w:sz w:val="12"/>
+          <w:szCs w:val="12"/>
+          <w:lang w:val="en-US"/>
+        </w:rPr>
+        <w:t xml:space="preserve"> = </w:t>
+      </w:r>
+      <w:r>
+        <w:rPr>
+          <w:color w:val="45B0E1" w:themeColor="accent1" w:themeTint="99"/>
+          <w:sz w:val="12"/>
+          <w:szCs w:val="12"/>
+          <w:lang w:val="en-US"/>
+        </w:rPr>
+        <w:t>[</w:t>
+      </w:r>
+      <w:r>
+        <w:rPr>
+          <w:color w:val="45B0E1" w:themeColor="accent1" w:themeTint="99"/>
+          <w:sz w:val="12"/>
+          <w:szCs w:val="12"/>
+          <w:lang w:val="en-US"/>
+        </w:rPr>
+        <w:t>100.0, 100.0, 100.0, 100.0, 100.0, 100.0, 100.0, 100.0, 100.0, 100.0</w:t>
+      </w:r>
+      <w:r>
+        <w:rPr>
+          <w:color w:val="45B0E1" w:themeColor="accent1" w:themeTint="99"/>
+          <w:sz w:val="12"/>
+          <w:szCs w:val="12"/>
+          <w:lang w:val="en-US"/>
+        </w:rPr>
+        <w:t>]</w:t>
+      </w:r>
+    </w:p>
+    <w:p>
+      <w:pPr>
+        <w:rPr>
+          <w:sz w:val="12"/>
+          <w:szCs w:val="12"/>
+          <w:lang w:val="en-US"/>
+        </w:rPr>
+      </w:pPr>
+      <w:proofErr w:type="spellStart"/>
+      <w:r>
+        <w:rPr>
+          <w:sz w:val="12"/>
+          <w:szCs w:val="12"/>
+          <w:lang w:val="en-US"/>
+        </w:rPr>
+        <w:t>occupancy_ascii_txt</w:t>
+      </w:r>
+      <w:proofErr w:type="spellEnd"/>
+      <w:r>
+        <w:rPr>
+          <w:sz w:val="12"/>
+          <w:szCs w:val="12"/>
+          <w:lang w:val="en-US"/>
+        </w:rPr>
+        <w:t xml:space="preserve"> = </w:t>
+      </w:r>
+      <w:r>
+        <w:rPr>
+          <w:sz w:val="12"/>
+          <w:szCs w:val="12"/>
+          <w:lang w:val="en-US"/>
+        </w:rPr>
+        <w:t>[</w:t>
+      </w:r>
+      <w:r>
+        <w:rPr>
+          <w:sz w:val="12"/>
+          <w:szCs w:val="12"/>
+          <w:lang w:val="en-US"/>
+        </w:rPr>
+        <w:t>12.5, 33.33333333333333, 0.0, 17.857142857142858, 28.57142857142857, 5.0, 10.416666666666668, 35.0, 0.0, 10.0</w:t>
+      </w:r>
+      <w:r>
+        <w:rPr>
+          <w:sz w:val="12"/>
+          <w:szCs w:val="12"/>
+          <w:lang w:val="en-US"/>
+        </w:rPr>
+        <w:t>]</w:t>
+      </w:r>
+    </w:p>
+    <w:p>
+      <w:pPr>
+        <w:rPr>
+          <w:sz w:val="12"/>
+          <w:szCs w:val="12"/>
+          <w:lang w:val="en-US"/>
+        </w:rPr>
+      </w:pPr>
+      <w:proofErr w:type="spellStart"/>
+      <w:r>
+        <w:rPr>
+          <w:sz w:val="12"/>
+          <w:szCs w:val="12"/>
+          <w:lang w:val="en-US"/>
+        </w:rPr>
+        <w:t>occupancy_jpg</w:t>
+      </w:r>
+      <w:proofErr w:type="spellEnd"/>
+      <w:r>
+        <w:rPr>
+          <w:sz w:val="12"/>
+          <w:szCs w:val="12"/>
+          <w:lang w:val="en-US"/>
+        </w:rPr>
+        <w:t xml:space="preserve"> = </w:t>
+      </w:r>
+      <w:r>
+        <w:rPr>
+          <w:sz w:val="12"/>
+          <w:szCs w:val="12"/>
+          <w:lang w:val="en-US"/>
+        </w:rPr>
+        <w:t>[</w:t>
+      </w:r>
+      <w:r>
+        <w:rPr>
+          <w:sz w:val="12"/>
+          <w:szCs w:val="12"/>
+          <w:lang w:val="en-US"/>
+        </w:rPr>
+        <w:t>6.25, 16.666666666666664, 5.88235294117647, 0.0, 21.428571428571427, 2.5, 12.5, 50.0, 12.5, 0.0</w:t>
+      </w:r>
+      <w:r>
+        <w:rPr>
+          <w:sz w:val="12"/>
+          <w:szCs w:val="12"/>
+          <w:lang w:val="en-US"/>
+        </w:rPr>
+        <w:t>]</w:t>
+      </w:r>
+    </w:p>
+    <w:p>
+      <w:pPr>
+        <w:rPr>
+          <w:sz w:val="12"/>
+          <w:szCs w:val="12"/>
+          <w:lang w:val="en-US"/>
+        </w:rPr>
+      </w:pPr>
+      <w:proofErr w:type="spellStart"/>
+      <w:r>
+        <w:rPr>
+          <w:sz w:val="12"/>
+          <w:szCs w:val="12"/>
+          <w:lang w:val="en-US"/>
+        </w:rPr>
+        <w:t>occupancy_json</w:t>
+      </w:r>
+      <w:proofErr w:type="spellEnd"/>
+      <w:r>
+        <w:rPr>
+          <w:sz w:val="12"/>
+          <w:szCs w:val="12"/>
+          <w:lang w:val="en-US"/>
+        </w:rPr>
+        <w:t xml:space="preserve"> = </w:t>
+      </w:r>
+      <w:r>
+        <w:rPr>
+          <w:sz w:val="12"/>
+          <w:szCs w:val="12"/>
+          <w:lang w:val="en-US"/>
+        </w:rPr>
+        <w:t>[</w:t>
+      </w:r>
+      <w:r>
+        <w:rPr>
+          <w:sz w:val="12"/>
+          <w:szCs w:val="12"/>
+          <w:lang w:val="en-US"/>
+        </w:rPr>
+        <w:t xml:space="preserve">100.0, 100.0, </w:t>
+      </w:r>
+      <w:r>
+        <w:rPr>
+          <w:color w:val="EE0000"/>
+          <w:sz w:val="12"/>
+          <w:szCs w:val="12"/>
+          <w:lang w:val="en-US"/>
+        </w:rPr>
+        <w:t>8.823529411764707, 17.857142857142858</w:t>
+      </w:r>
+      <w:r>
+        <w:rPr>
+          <w:sz w:val="12"/>
+          <w:szCs w:val="12"/>
+          <w:lang w:val="en-US"/>
+        </w:rPr>
+        <w:t>, 100.0</w:t>
+      </w:r>
+      <w:r>
+        <w:rPr>
+          <w:color w:val="EE0000"/>
+          <w:sz w:val="12"/>
+          <w:szCs w:val="12"/>
+          <w:lang w:val="en-US"/>
+        </w:rPr>
+        <w:t xml:space="preserve">, 90.0, </w:t>
+      </w:r>
+      <w:r>
+        <w:rPr>
+          <w:sz w:val="12"/>
+          <w:szCs w:val="12"/>
+          <w:lang w:val="en-US"/>
+        </w:rPr>
+        <w:t xml:space="preserve">100.0, 100.0, </w:t>
+      </w:r>
+      <w:r>
+        <w:rPr>
+          <w:color w:val="EE0000"/>
+          <w:sz w:val="12"/>
+          <w:szCs w:val="12"/>
+          <w:lang w:val="en-US"/>
+        </w:rPr>
+        <w:t>56.25, 10.0</w:t>
+      </w:r>
+      <w:r>
+        <w:rPr>
+          <w:sz w:val="12"/>
+          <w:szCs w:val="12"/>
+          <w:lang w:val="en-US"/>
+        </w:rPr>
+        <w:t>]</w:t>
+      </w:r>
+    </w:p>
+    <w:p>
+      <w:pPr>
+        <w:rPr>
+          <w:sz w:val="12"/>
+          <w:szCs w:val="12"/>
+          <w:lang w:val="en-US"/>
+        </w:rPr>
+      </w:pPr>
+      <w:proofErr w:type="spellStart"/>
+      <w:r>
+        <w:rPr>
+          <w:sz w:val="12"/>
+          <w:szCs w:val="12"/>
+          <w:lang w:val="en-US"/>
+        </w:rPr>
+        <w:t>occupancy_tokenized_txt</w:t>
+      </w:r>
+      <w:proofErr w:type="spellEnd"/>
+      <w:r>
+        <w:rPr>
+          <w:sz w:val="12"/>
+          <w:szCs w:val="12"/>
+          <w:lang w:val="en-US"/>
+        </w:rPr>
+        <w:t xml:space="preserve"> = </w:t>
+      </w:r>
+      <w:r>
+        <w:rPr>
+          <w:sz w:val="12"/>
+          <w:szCs w:val="12"/>
+          <w:lang w:val="en-US"/>
+        </w:rPr>
+        <w:t>[</w:t>
+      </w:r>
+      <w:r>
+        <w:rPr>
+          <w:sz w:val="12"/>
+          <w:szCs w:val="12"/>
+          <w:lang w:val="en-US"/>
+        </w:rPr>
+        <w:t xml:space="preserve">100.0, 100.0, 100.0, 100.0, 100.0, 100.0, </w:t>
+      </w:r>
+      <w:r>
+        <w:rPr>
+          <w:color w:val="EE0000"/>
+          <w:sz w:val="12"/>
+          <w:szCs w:val="12"/>
+          <w:lang w:val="en-US"/>
+        </w:rPr>
+        <w:t>29.166666666666668</w:t>
+      </w:r>
+      <w:r>
+        <w:rPr>
+          <w:sz w:val="12"/>
+          <w:szCs w:val="12"/>
+          <w:lang w:val="en-US"/>
+        </w:rPr>
+        <w:t>, 100.0, 100.0, 100.0</w:t>
+      </w:r>
+      <w:r>
+        <w:rPr>
+          <w:sz w:val="12"/>
+          <w:szCs w:val="12"/>
+          <w:lang w:val="en-US"/>
+        </w:rPr>
+        <w:t>]</w:t>
+      </w:r>
     </w:p>
     <w:p>
       <w:pPr>

</xml_diff>